<commit_message>
feat(g2): mise en page, sorties à côté de la source, charte Forge & Lumière papier (v0.3.0)
</commit_message>
<xml_diff>
--- a/templates/reference.docx
+++ b/templates/reference.docx
@@ -382,7 +382,9 @@
 </w:t>
       </w:r>
     </w:p>
-    <w:sectPr/>
+    <w:sectPr>
+      <w:pgMar w:top="907" w:bottom="907" w:left="1020" w:right="1020"/>
+    </w:sectPr>
   </w:body>
 </w:document>
 </file>
@@ -561,21 +563,42 @@
   <w:style w:type="paragraph" w:default="1" w:styleId="Normal">
     <w:name w:val="Normal"/>
     <w:qFormat/>
+    <w:pPr>
+      <w:spacing w:line="276" w:lineRule="auto" w:after="140"/>
+    </w:pPr>
+    <w:rPr>
+      <w:rFonts w:ascii="Roboto" w:hAnsi="Roboto" w:cs="Roboto" w:eastAsia="Roboto"/>
+      <w:color w:val="132639"/>
+      <w:sz w:val="22"/>
+    </w:rPr>
   </w:style>
   <w:style w:type="paragraph" w:styleId="BodyText">
     <w:name w:val="Body Text"/>
     <w:basedOn w:val="Normal"/>
     <w:link w:val="BodyTextChar"/>
     <w:pPr>
-      <w:spacing w:before="180" w:after="180"/>
-    </w:pPr>
-    <w:qFormat/>
+      <w:spacing w:before="180" w:after="140" w:line="276" w:lineRule="auto"/>
+    </w:pPr>
+    <w:qFormat/>
+    <w:rPr>
+      <w:rFonts w:ascii="Roboto" w:hAnsi="Roboto" w:cs="Roboto" w:eastAsia="Roboto"/>
+      <w:color w:val="132639"/>
+      <w:sz w:val="22"/>
+    </w:rPr>
   </w:style>
   <w:style w:type="paragraph" w:customStyle="1" w:styleId="FirstParagraph">
     <w:name w:val="First Paragraph"/>
     <w:basedOn w:val="BodyText"/>
     <w:next w:val="BodyText"/>
     <w:qFormat/>
+    <w:pPr>
+      <w:spacing w:line="276" w:lineRule="auto" w:after="140"/>
+    </w:pPr>
+    <w:rPr>
+      <w:rFonts w:ascii="Roboto" w:hAnsi="Roboto" w:cs="Roboto" w:eastAsia="Roboto"/>
+      <w:color w:val="132639"/>
+      <w:sz w:val="22"/>
+    </w:rPr>
   </w:style>
   <w:style w:type="paragraph" w:customStyle="1" w:styleId="Compact">
     <w:name w:val="Compact"/>
@@ -584,6 +607,11 @@
     <w:pPr>
       <w:spacing w:before="36" w:after="36"/>
     </w:pPr>
+    <w:rPr>
+      <w:rFonts w:ascii="Roboto" w:hAnsi="Roboto" w:cs="Roboto" w:eastAsia="Roboto"/>
+      <w:color w:val="132639"/>
+      <w:sz w:val="22"/>
+    </w:rPr>
   </w:style>
   <w:style w:type="paragraph" w:styleId="Title">
     <w:name w:val="Title"/>
@@ -597,11 +625,11 @@
       <w:jc w:val="center"/>
     </w:pPr>
     <w:rPr>
-      <w:rFonts w:asciiTheme="majorHAnsi" w:eastAsiaTheme="majorEastAsia" w:hAnsiTheme="majorHAnsi" w:cstheme="majorBidi"/>
+      <w:rFonts w:asciiTheme="majorHAnsi" w:eastAsiaTheme="majorEastAsia" w:hAnsiTheme="majorHAnsi" w:cstheme="majorBidi" w:ascii="Roboto" w:hAnsi="Roboto" w:cs="Roboto" w:eastAsia="Roboto"/>
       <w:b/>
       <w:bCs/>
-      <w:color w:val="345A8A" w:themeColor="accent1" w:themeShade="B5"/>
-      <w:sz w:val="36"/>
+      <w:color w:val="132639"/>
+      <w:sz w:val="34"/>
       <w:szCs w:val="36"/>
     </w:rPr>
   </w:style>
@@ -617,7 +645,10 @@
       <w:jc w:val="center"/>
     </w:pPr>
     <w:rPr>
-      <w:sz w:val="30"/>
+      <w:rFonts w:ascii="Roboto" w:hAnsi="Roboto" w:cs="Roboto" w:eastAsia="Roboto"/>
+      <w:i/>
+      <w:color w:val="555555"/>
+      <w:sz w:val="22"/>
       <w:szCs w:val="30"/>
     </w:rPr>
   </w:style>
@@ -630,6 +661,11 @@
       <w:keepLines/>
       <w:jc w:val="center"/>
     </w:pPr>
+    <w:rPr>
+      <w:rFonts w:ascii="Roboto" w:hAnsi="Roboto" w:cs="Roboto" w:eastAsia="Roboto"/>
+      <w:color w:val="555555"/>
+      <w:sz w:val="20"/>
+    </w:rPr>
   </w:style>
   <w:style w:type="paragraph" w:styleId="Date">
     <w:name w:val="Date"/>
@@ -640,6 +676,11 @@
       <w:keepLines/>
       <w:jc w:val="center"/>
     </w:pPr>
+    <w:rPr>
+      <w:rFonts w:ascii="Roboto" w:hAnsi="Roboto" w:cs="Roboto" w:eastAsia="Roboto"/>
+      <w:color w:val="555555"/>
+      <w:sz w:val="20"/>
+    </w:rPr>
   </w:style>
   <w:style w:type="paragraph" w:customStyle="1" w:styleId="AbstractTitle">
     <w:name w:val="Abstract Title"/>
@@ -653,11 +694,11 @@
       <w:spacing w:before="300" w:after="0"/>
     </w:pPr>
     <w:rPr>
-      <w:sz w:val="20"/>
+      <w:color w:val="132639"/>
+      <w:sz w:val="22"/>
       <w:szCs w:val="20"/>
+      <w:rFonts w:ascii="Roboto" w:hAnsi="Roboto" w:cs="Roboto" w:eastAsia="Roboto"/>
       <w:b/>
-      <w:color w:val="345A8A"/>
-      &gt;
     </w:rPr>
   </w:style>
   <w:style w:type="paragraph" w:customStyle="1" w:styleId="Abstract">
@@ -671,7 +712,9 @@
       <w:spacing w:before="100" w:after="300"/>
     </w:pPr>
     <w:rPr>
-      <w:sz w:val="20"/>
+      <w:rFonts w:ascii="Roboto" w:hAnsi="Roboto" w:cs="Roboto" w:eastAsia="Roboto"/>
+      <w:color w:val="132639"/>
+      <w:sz w:val="22"/>
       <w:szCs w:val="20"/>
     </w:rPr>
   </w:style>
@@ -681,7 +724,11 @@
     <w:next w:val="Bibliography"/>
     <w:qFormat/>
     <w:pPr/>
-    <w:rPr/>
+    <w:rPr>
+      <w:rFonts w:ascii="Roboto" w:hAnsi="Roboto" w:cs="Roboto" w:eastAsia="Roboto"/>
+      <w:color w:val="132639"/>
+      <w:sz w:val="22"/>
+    </w:rPr>
   </w:style>
   <w:style w:type="paragraph" w:styleId="Heading1">
     <w:name w:val="Heading 1"/>
@@ -692,15 +739,18 @@
     <w:pPr>
       <w:keepNext/>
       <w:keepLines/>
-      <w:spacing w:before="480" w:after="0"/>
+      <w:spacing w:before="360" w:after="160"/>
       <w:outlineLvl w:val="0"/>
-    </w:pPr>
-    <w:rPr>
-      <w:rFonts w:asciiTheme="majorHAnsi" w:eastAsiaTheme="majorEastAsia" w:hAnsiTheme="majorHAnsi" w:cstheme="majorBidi"/>
+      <w:pBdr>
+        <w:bottom w:val="single" w:sz="8" w:space="1" w:color="00B4D8"/>
+      </w:pBdr>
+    </w:pPr>
+    <w:rPr>
+      <w:rFonts w:asciiTheme="majorHAnsi" w:eastAsiaTheme="majorEastAsia" w:hAnsiTheme="majorHAnsi" w:cstheme="majorBidi" w:ascii="Roboto" w:hAnsi="Roboto" w:cs="Roboto" w:eastAsia="Roboto"/>
       <w:b/>
       <w:bCs/>
-      <w:color w:val="4F81BD" w:themeColor="accent1"/>
-      <w:sz w:val="32"/>
+      <w:color w:val="132639"/>
+      <w:sz w:val="30"/>
       <w:szCs w:val="32"/>
     </w:rPr>
   </w:style>
@@ -714,15 +764,15 @@
     <w:pPr>
       <w:keepNext/>
       <w:keepLines/>
-      <w:spacing w:before="200" w:after="0"/>
+      <w:spacing w:before="280" w:after="120"/>
       <w:outlineLvl w:val="1"/>
     </w:pPr>
     <w:rPr>
-      <w:rFonts w:asciiTheme="majorHAnsi" w:eastAsiaTheme="majorEastAsia" w:hAnsiTheme="majorHAnsi" w:cstheme="majorBidi"/>
+      <w:rFonts w:asciiTheme="majorHAnsi" w:eastAsiaTheme="majorEastAsia" w:hAnsiTheme="majorHAnsi" w:cstheme="majorBidi" w:ascii="Roboto" w:hAnsi="Roboto" w:cs="Roboto" w:eastAsia="Roboto"/>
       <w:b/>
       <w:bCs/>
-      <w:color w:val="4F81BD" w:themeColor="accent1"/>
-      <w:sz w:val="28"/>
+      <w:color w:val="B85C38"/>
+      <w:sz w:val="26"/>
       <w:szCs w:val="28"/>
     </w:rPr>
   </w:style>
@@ -740,11 +790,11 @@
       <w:outlineLvl w:val="2"/>
     </w:pPr>
     <w:rPr>
-      <w:rFonts w:asciiTheme="majorHAnsi" w:eastAsiaTheme="majorEastAsia" w:hAnsiTheme="majorHAnsi" w:cstheme="majorBidi"/>
+      <w:rFonts w:asciiTheme="majorHAnsi" w:eastAsiaTheme="majorEastAsia" w:hAnsiTheme="majorHAnsi" w:cstheme="majorBidi" w:ascii="Roboto" w:hAnsi="Roboto" w:cs="Roboto" w:eastAsia="Roboto"/>
       <w:b/>
       <w:bCs/>
-      <w:color w:val="4F81BD" w:themeColor="accent1"/>
-      <w:sz w:val="24"/>
+      <w:color w:val="132639"/>
+      <w:sz w:val="23"/>
       <w:szCs w:val="24"/>
     </w:rPr>
   </w:style>
@@ -762,11 +812,12 @@
       <w:outlineLvl w:val="3"/>
     </w:pPr>
     <w:rPr>
-      <w:rFonts w:asciiTheme="majorHAnsi" w:eastAsiaTheme="majorEastAsia" w:hAnsiTheme="majorHAnsi" w:cstheme="majorBidi"/>
+      <w:rFonts w:asciiTheme="majorHAnsi" w:eastAsiaTheme="majorEastAsia" w:hAnsiTheme="majorHAnsi" w:cstheme="majorBidi" w:ascii="Roboto" w:hAnsi="Roboto" w:cs="Roboto" w:eastAsia="Roboto"/>
       <w:i/>
+      <w:b/>
       <w:bCs/>
-      <w:color w:val="4F81BD" w:themeColor="accent1"/>
-      <w:sz w:val="24"/>
+      <w:color w:val="555555"/>
+      <w:sz w:val="22"/>
       <w:szCs w:val="24"/>
     </w:rPr>
   </w:style>
@@ -784,10 +835,11 @@
       <w:outlineLvl w:val="4"/>
     </w:pPr>
     <w:rPr>
-      <w:rFonts w:asciiTheme="majorHAnsi" w:eastAsiaTheme="majorEastAsia" w:hAnsiTheme="majorHAnsi" w:cstheme="majorBidi"/>
+      <w:rFonts w:asciiTheme="majorHAnsi" w:eastAsiaTheme="majorEastAsia" w:hAnsiTheme="majorHAnsi" w:cstheme="majorBidi" w:ascii="Roboto" w:hAnsi="Roboto" w:cs="Roboto" w:eastAsia="Roboto"/>
+      <w:b/>
       <w:iCs/>
-      <w:color w:val="4F81BD" w:themeColor="accent1"/>
-      <w:sz w:val="24"/>
+      <w:color w:val="555555"/>
+      <w:sz w:val="22"/>
       <w:szCs w:val="24"/>
     </w:rPr>
   </w:style>
@@ -805,9 +857,10 @@
       <w:outlineLvl w:val="5"/>
     </w:pPr>
     <w:rPr>
-      <w:rFonts w:asciiTheme="majorHAnsi" w:eastAsiaTheme="majorEastAsia" w:hAnsiTheme="majorHAnsi" w:cstheme="majorBidi"/>
-      <w:color w:val="4F81BD" w:themeColor="accent1"/>
-      <w:sz w:val="24"/>
+      <w:rFonts w:asciiTheme="majorHAnsi" w:eastAsiaTheme="majorEastAsia" w:hAnsiTheme="majorHAnsi" w:cstheme="majorBidi" w:ascii="Roboto" w:hAnsi="Roboto" w:cs="Roboto" w:eastAsia="Roboto"/>
+      <w:b/>
+      <w:color w:val="555555"/>
+      <w:sz w:val="22"/>
       <w:szCs w:val="24"/>
     </w:rPr>
   </w:style>
@@ -825,9 +878,10 @@
       <w:outlineLvl w:val="6"/>
     </w:pPr>
     <w:rPr>
-      <w:rFonts w:asciiTheme="majorHAnsi" w:eastAsiaTheme="majorEastAsia" w:hAnsiTheme="majorHAnsi" w:cstheme="majorBidi"/>
-      <w:color w:val="4F81BD" w:themeColor="accent1"/>
-      <w:sz w:val="24"/>
+      <w:rFonts w:asciiTheme="majorHAnsi" w:eastAsiaTheme="majorEastAsia" w:hAnsiTheme="majorHAnsi" w:cstheme="majorBidi" w:ascii="Roboto" w:hAnsi="Roboto" w:cs="Roboto" w:eastAsia="Roboto"/>
+      <w:b/>
+      <w:color w:val="555555"/>
+      <w:sz w:val="22"/>
       <w:szCs w:val="24"/>
     </w:rPr>
   </w:style>
@@ -845,9 +899,10 @@
       <w:outlineLvl w:val="7"/>
     </w:pPr>
     <w:rPr>
-      <w:rFonts w:asciiTheme="majorHAnsi" w:eastAsiaTheme="majorEastAsia" w:hAnsiTheme="majorHAnsi" w:cstheme="majorBidi"/>
-      <w:color w:val="4F81BD" w:themeColor="accent1"/>
-      <w:sz w:val="24"/>
+      <w:rFonts w:asciiTheme="majorHAnsi" w:eastAsiaTheme="majorEastAsia" w:hAnsiTheme="majorHAnsi" w:cstheme="majorBidi" w:ascii="Roboto" w:hAnsi="Roboto" w:cs="Roboto" w:eastAsia="Roboto"/>
+      <w:b/>
+      <w:color w:val="555555"/>
+      <w:sz w:val="22"/>
       <w:szCs w:val="24"/>
     </w:rPr>
   </w:style>
@@ -865,9 +920,10 @@
       <w:outlineLvl w:val="8"/>
     </w:pPr>
     <w:rPr>
-      <w:rFonts w:asciiTheme="majorHAnsi" w:eastAsiaTheme="majorEastAsia" w:hAnsiTheme="majorHAnsi" w:cstheme="majorBidi"/>
-      <w:color w:val="4F81BD" w:themeColor="accent1"/>
-      <w:sz w:val="24"/>
+      <w:rFonts w:asciiTheme="majorHAnsi" w:eastAsiaTheme="majorEastAsia" w:hAnsiTheme="majorHAnsi" w:cstheme="majorBidi" w:ascii="Roboto" w:hAnsi="Roboto" w:cs="Roboto" w:eastAsia="Roboto"/>
+      <w:b/>
+      <w:color w:val="555555"/>
+      <w:sz w:val="22"/>
       <w:szCs w:val="24"/>
     </w:rPr>
   </w:style>
@@ -882,6 +938,11 @@
       <w:spacing w:before="100" w:after="100"/>
       <w:ind w:firstLine="0" w:left="480" w:right="480"/>
     </w:pPr>
+    <w:rPr>
+      <w:rFonts w:ascii="Roboto" w:hAnsi="Roboto" w:cs="Roboto" w:eastAsia="Roboto"/>
+      <w:color w:val="132639"/>
+      <w:sz w:val="22"/>
+    </w:rPr>
   </w:style>
   <w:style w:type="paragraph" w:styleId="FootnoteText">
     <w:name w:val="Footnote Text"/>
@@ -890,6 +951,11 @@
     <w:uiPriority w:val="9"/>
     <w:unhideWhenUsed/>
     <w:qFormat/>
+    <w:rPr>
+      <w:rFonts w:ascii="Roboto" w:hAnsi="Roboto" w:cs="Roboto" w:eastAsia="Roboto"/>
+      <w:color w:val="555555"/>
+      <w:sz w:val="18"/>
+    </w:rPr>
   </w:style>
   <w:style w:type="character" w:default="1" w:styleId="DefaultParagraphFont">
     <w:name w:val="Default Paragraph Font"/>
@@ -937,12 +1003,20 @@
       <w:spacing w:after="0"/>
     </w:pPr>
     <w:rPr>
+      <w:rFonts w:ascii="Roboto" w:hAnsi="Roboto" w:cs="Roboto" w:eastAsia="Roboto"/>
       <w:b/>
+      <w:color w:val="132639"/>
+      <w:sz w:val="22"/>
     </w:rPr>
   </w:style>
   <w:style w:type="paragraph" w:customStyle="1" w:styleId="Definition">
     <w:name w:val="Definition"/>
     <w:basedOn w:val="Normal"/>
+    <w:rPr>
+      <w:rFonts w:ascii="Roboto" w:hAnsi="Roboto" w:cs="Roboto" w:eastAsia="Roboto"/>
+      <w:color w:val="132639"/>
+      <w:sz w:val="22"/>
+    </w:rPr>
   </w:style>
   <w:style w:type="paragraph" w:styleId="Caption">
     <w:name w:val="Caption"/>
@@ -952,7 +1026,10 @@
       <w:spacing w:before="0" w:after="120"/>
     </w:pPr>
     <w:rPr>
+      <w:rFonts w:ascii="Roboto" w:hAnsi="Roboto" w:cs="Roboto" w:eastAsia="Roboto"/>
       <w:i/>
+      <w:color w:val="555555"/>
+      <w:sz w:val="18"/>
     </w:rPr>
   </w:style>
   <w:style w:type="paragraph" w:customStyle="1" w:styleId="TableCaption">
@@ -961,10 +1038,20 @@
     <w:pPr>
       <w:keepNext/>
     </w:pPr>
+    <w:rPr>
+      <w:rFonts w:ascii="Roboto" w:hAnsi="Roboto" w:cs="Roboto" w:eastAsia="Roboto"/>
+      <w:color w:val="555555"/>
+      <w:sz w:val="18"/>
+    </w:rPr>
   </w:style>
   <w:style w:type="paragraph" w:customStyle="1" w:styleId="ImageCaption">
     <w:name w:val="Image Caption"/>
     <w:basedOn w:val="Caption"/>
+    <w:rPr>
+      <w:rFonts w:ascii="Roboto" w:hAnsi="Roboto" w:cs="Roboto" w:eastAsia="Roboto"/>
+      <w:color w:val="555555"/>
+      <w:sz w:val="18"/>
+    </w:rPr>
   </w:style>
   <w:style w:type="paragraph" w:customStyle="1" w:styleId="Figure">
     <w:name w:val="Figure"/>
@@ -986,8 +1073,9 @@
     <w:name w:val="Verbatim Char"/>
     <w:basedOn w:val="BodyTextChar"/>
     <w:rPr>
-      <w:rFonts w:ascii="Consolas" w:hAnsi="Consolas"/>
-      <w:sz w:val="22"/>
+      <w:rFonts w:ascii="Roboto Mono" w:hAnsi="Roboto Mono" w:cs="Roboto Mono" w:eastAsia="Roboto Mono"/>
+      <w:color w:val="132639"/>
+      <w:sz w:val="19"/>
     </w:rPr>
   </w:style>
   <w:style w:type="character" w:customStyle="1" w:styleId="SectionNumber">
@@ -1005,7 +1093,9 @@
     <w:name w:val="Hyperlink"/>
     <w:basedOn w:val="BodyTextChar"/>
     <w:rPr>
-      <w:color w:val="4F81BD" w:themeColor="accent1"/>
+      <w:rFonts w:ascii="Roboto" w:hAnsi="Roboto" w:cs="Roboto" w:eastAsia="Roboto"/>
+      <w:color w:val="0077A8"/>
+      <w:u w:val="single"/>
     </w:rPr>
   </w:style>
   <w:style w:type="paragraph" w:styleId="TOCHeading">
@@ -1020,10 +1110,11 @@
       <w:outlineLvl w:val="9"/>
     </w:pPr>
     <w:rPr>
-      <w:rFonts w:asciiTheme="majorHAnsi" w:eastAsiaTheme="majorEastAsia" w:hAnsiTheme="majorHAnsi" w:cstheme="majorBidi"/>
-      <w:b w:val="0"/>
+      <w:rFonts w:asciiTheme="majorHAnsi" w:eastAsiaTheme="majorEastAsia" w:hAnsiTheme="majorHAnsi" w:cstheme="majorBidi" w:ascii="Roboto" w:hAnsi="Roboto" w:cs="Roboto" w:eastAsia="Roboto"/>
+      <w:b/>
       <w:bCs w:val="0"/>
-      <w:color w:val="365F91" w:themeColor="accent1" w:themeShade="BF"/>
+      <w:color w:val="132639"/>
+      <w:sz w:val="26"/>
     </w:rPr>
   </w:style>
 </w:styles>

</xml_diff>